<commit_message>
bejentkezes html, css kesz, javaScript maradt
</commit_message>
<xml_diff>
--- a/űrlapok gyakorlás 02.26..docx
+++ b/űrlapok gyakorlás 02.26..docx
@@ -1,6 +1,6 @@
 
 <file path=word/document.xml><?xml version="1.0" encoding="utf-8"?>
-<w:document xmlns:wpc="http://schemas.microsoft.com/office/word/2010/wordprocessingCanvas" xmlns:cx="http://schemas.microsoft.com/office/drawing/2014/chartex" xmlns:cx1="http://schemas.microsoft.com/office/drawing/2015/9/8/chartex" xmlns:cx2="http://schemas.microsoft.com/office/drawing/2015/10/21/chartex" xmlns:cx3="http://schemas.microsoft.com/office/drawing/2016/5/9/chartex" xmlns:cx4="http://schemas.microsoft.com/office/drawing/2016/5/10/chartex" xmlns:cx5="http://schemas.microsoft.com/office/drawing/2016/5/11/chartex" xmlns:cx6="http://schemas.microsoft.com/office/drawing/2016/5/12/chartex" xmlns:cx7="http://schemas.microsoft.com/office/drawing/2016/5/13/chartex" xmlns:cx8="http://schemas.microsoft.com/office/drawing/2016/5/14/chartex" xmlns:mc="http://schemas.openxmlformats.org/markup-compatibility/2006" xmlns:aink="http://schemas.microsoft.com/office/drawing/2016/ink" xmlns:am3d="http://schemas.microsoft.com/office/drawing/2017/model3d" xmlns:o="urn:schemas-microsoft-com:office:office" xmlns:r="http://schemas.openxmlformats.org/officeDocument/2006/relationships" xmlns:m="http://schemas.openxmlformats.org/officeDocument/2006/math" xmlns:v="urn:schemas-microsoft-com:vml" xmlns:wp14="http://schemas.microsoft.com/office/word/2010/wordprocessingDrawing" xmlns:wp="http://schemas.openxmlformats.org/drawingml/2006/wordprocessingDrawing" xmlns:w10="urn:schemas-microsoft-com:office:word" xmlns:w="http://schemas.openxmlformats.org/wordprocessingml/2006/main" xmlns:w14="http://schemas.microsoft.com/office/word/2010/wordml" xmlns:w15="http://schemas.microsoft.com/office/word/2012/wordml" xmlns:w16cex="http://schemas.microsoft.com/office/word/2018/wordml/cex" xmlns:w16cid="http://schemas.microsoft.com/office/word/2016/wordml/cid" xmlns:w16="http://schemas.microsoft.com/office/word/2018/wordml" xmlns:w16sdtdh="http://schemas.microsoft.com/office/word/2020/wordml/sdtdatahash" xmlns:w16se="http://schemas.microsoft.com/office/word/2015/wordml/symex" xmlns:wpg="http://schemas.microsoft.com/office/word/2010/wordprocessingGroup" xmlns:wpi="http://schemas.microsoft.com/office/word/2010/wordprocessingInk" xmlns:wne="http://schemas.microsoft.com/office/word/2006/wordml" xmlns:wps="http://schemas.microsoft.com/office/word/2010/wordprocessingShape" mc:Ignorable="w14 w15 w16se w16cid w16 w16cex w16sdtdh wp14">
+<w:document xmlns:wpc="http://schemas.microsoft.com/office/word/2010/wordprocessingCanvas" xmlns:cx="http://schemas.microsoft.com/office/drawing/2014/chartex" xmlns:cx1="http://schemas.microsoft.com/office/drawing/2015/9/8/chartex" xmlns:cx2="http://schemas.microsoft.com/office/drawing/2015/10/21/chartex" xmlns:cx3="http://schemas.microsoft.com/office/drawing/2016/5/9/chartex" xmlns:cx4="http://schemas.microsoft.com/office/drawing/2016/5/10/chartex" xmlns:cx5="http://schemas.microsoft.com/office/drawing/2016/5/11/chartex" xmlns:cx6="http://schemas.microsoft.com/office/drawing/2016/5/12/chartex" xmlns:cx7="http://schemas.microsoft.com/office/drawing/2016/5/13/chartex" xmlns:cx8="http://schemas.microsoft.com/office/drawing/2016/5/14/chartex" xmlns:mc="http://schemas.openxmlformats.org/markup-compatibility/2006" xmlns:aink="http://schemas.microsoft.com/office/drawing/2016/ink" xmlns:am3d="http://schemas.microsoft.com/office/drawing/2017/model3d" xmlns:o="urn:schemas-microsoft-com:office:office" xmlns:oel="http://schemas.microsoft.com/office/2019/extlst" xmlns:r="http://schemas.openxmlformats.org/officeDocument/2006/relationships" xmlns:m="http://schemas.openxmlformats.org/officeDocument/2006/math" xmlns:v="urn:schemas-microsoft-com:vml" xmlns:wp14="http://schemas.microsoft.com/office/word/2010/wordprocessingDrawing" xmlns:wp="http://schemas.openxmlformats.org/drawingml/2006/wordprocessingDrawing" xmlns:w10="urn:schemas-microsoft-com:office:word" xmlns:w="http://schemas.openxmlformats.org/wordprocessingml/2006/main" xmlns:w14="http://schemas.microsoft.com/office/word/2010/wordml" xmlns:w15="http://schemas.microsoft.com/office/word/2012/wordml" xmlns:w16cex="http://schemas.microsoft.com/office/word/2018/wordml/cex" xmlns:w16cid="http://schemas.microsoft.com/office/word/2016/wordml/cid" xmlns:w16="http://schemas.microsoft.com/office/word/2018/wordml" xmlns:w16du="http://schemas.microsoft.com/office/word/2023/wordml/word16du" xmlns:w16sdtdh="http://schemas.microsoft.com/office/word/2020/wordml/sdtdatahash" xmlns:w16se="http://schemas.microsoft.com/office/word/2015/wordml/symex" xmlns:wpg="http://schemas.microsoft.com/office/word/2010/wordprocessingGroup" xmlns:wpi="http://schemas.microsoft.com/office/word/2010/wordprocessingInk" xmlns:wne="http://schemas.microsoft.com/office/word/2006/wordml" xmlns:wps="http://schemas.microsoft.com/office/word/2010/wordprocessingShape" mc:Ignorable="w14 w15 w16se w16cid w16 w16cex w16sdtdh w16du wp14">
   <w:body>
     <w:p>
       <w:pPr>
@@ -100,13 +100,13 @@
         <mc:AlternateContent>
           <mc:Choice Requires="wps">
             <w:drawing>
-              <wp:anchor distT="0" distB="0" distL="114300" distR="114300" simplePos="0" relativeHeight="251659264" behindDoc="0" locked="0" layoutInCell="1" allowOverlap="1" wp14:anchorId="2C32B9D6" wp14:editId="360C5CB2">
+              <wp:anchor distT="0" distB="0" distL="114300" distR="114300" simplePos="0" relativeHeight="251659264" behindDoc="0" locked="0" layoutInCell="1" allowOverlap="1" wp14:anchorId="2C32B9D6" wp14:editId="719906BF">
                 <wp:simplePos x="0" y="0"/>
                 <wp:positionH relativeFrom="column">
-                  <wp:posOffset>2914754</wp:posOffset>
+                  <wp:posOffset>2962275</wp:posOffset>
                 </wp:positionH>
                 <wp:positionV relativeFrom="paragraph">
-                  <wp:posOffset>57283</wp:posOffset>
+                  <wp:posOffset>57150</wp:posOffset>
                 </wp:positionV>
                 <wp:extent cx="12226" cy="3370997"/>
                 <wp:effectExtent l="19050" t="19050" r="26035" b="20320"/>
@@ -162,7 +162,7 @@
           </mc:Choice>
           <mc:Fallback>
             <w:pict>
-              <v:line w14:anchorId="459B91D2" id="Egyenes összekötő 3" o:spid="_x0000_s1026" style="position:absolute;flip:x;z-index:251659264;visibility:visible;mso-wrap-style:square;mso-width-percent:0;mso-height-percent:0;mso-wrap-distance-left:9pt;mso-wrap-distance-top:0;mso-wrap-distance-right:9pt;mso-wrap-distance-bottom:0;mso-position-horizontal:absolute;mso-position-horizontal-relative:text;mso-position-vertical:absolute;mso-position-vertical-relative:text;mso-width-percent:0;mso-height-percent:0;mso-width-relative:margin;mso-height-relative:margin" from="229.5pt,4.5pt" to="230.45pt,269.95pt" o:gfxdata="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" strokecolor="#1f3763 [1604]" strokeweight="2.25pt">
+              <v:line w14:anchorId="7E058EEB" id="Egyenes összekötő 3" o:spid="_x0000_s1026" style="position:absolute;flip:x;z-index:251659264;visibility:visible;mso-wrap-style:square;mso-width-percent:0;mso-height-percent:0;mso-wrap-distance-left:9pt;mso-wrap-distance-top:0;mso-wrap-distance-right:9pt;mso-wrap-distance-bottom:0;mso-position-horizontal:absolute;mso-position-horizontal-relative:text;mso-position-vertical:absolute;mso-position-vertical-relative:text;mso-width-percent:0;mso-height-percent:0;mso-width-relative:margin;mso-height-relative:margin" from="233.25pt,4.5pt" to="234.2pt,269.95pt" o:gfxdata="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" strokecolor="#1f3763 [1604]" strokeweight="2.25pt">
                 <v:stroke joinstyle="miter"/>
               </v:line>
             </w:pict>
@@ -230,6 +230,12 @@
         </w:drawing>
       </w:r>
       <w:r>
+        <w:t>20</w:t>
+      </w:r>
+      <w:r>
+        <w:tab/>
+      </w:r>
+      <w:r>
         <w:tab/>
       </w:r>
       <w:r>
@@ -290,6 +296,7 @@
         <w:pStyle w:val="Listaszerbekezds"/>
       </w:pPr>
       <w:r>
+        <w:lastRenderedPageBreak/>
         <w:t>Asztali:</w:t>
       </w:r>
     </w:p>
@@ -301,7 +308,6 @@
         <w:rPr>
           <w:noProof/>
         </w:rPr>
-        <w:lastRenderedPageBreak/>
         <w:drawing>
           <wp:inline distT="0" distB="0" distL="0" distR="0" wp14:anchorId="3866862E" wp14:editId="26C10DA3">
             <wp:extent cx="5760720" cy="2656840"/>
@@ -652,7 +658,7 @@
 </file>
 
 <file path=word/numbering.xml><?xml version="1.0" encoding="utf-8"?>
-<w:numbering xmlns:wpc="http://schemas.microsoft.com/office/word/2010/wordprocessingCanvas" xmlns:cx="http://schemas.microsoft.com/office/drawing/2014/chartex" xmlns:cx1="http://schemas.microsoft.com/office/drawing/2015/9/8/chartex" xmlns:cx2="http://schemas.microsoft.com/office/drawing/2015/10/21/chartex" xmlns:cx3="http://schemas.microsoft.com/office/drawing/2016/5/9/chartex" xmlns:cx4="http://schemas.microsoft.com/office/drawing/2016/5/10/chartex" xmlns:cx5="http://schemas.microsoft.com/office/drawing/2016/5/11/chartex" xmlns:cx6="http://schemas.microsoft.com/office/drawing/2016/5/12/chartex" xmlns:cx7="http://schemas.microsoft.com/office/drawing/2016/5/13/chartex" xmlns:cx8="http://schemas.microsoft.com/office/drawing/2016/5/14/chartex" xmlns:mc="http://schemas.openxmlformats.org/markup-compatibility/2006" xmlns:aink="http://schemas.microsoft.com/office/drawing/2016/ink" xmlns:am3d="http://schemas.microsoft.com/office/drawing/2017/model3d" xmlns:o="urn:schemas-microsoft-com:office:office" xmlns:r="http://schemas.openxmlformats.org/officeDocument/2006/relationships" xmlns:m="http://schemas.openxmlformats.org/officeDocument/2006/math" xmlns:v="urn:schemas-microsoft-com:vml" xmlns:wp14="http://schemas.microsoft.com/office/word/2010/wordprocessingDrawing" xmlns:wp="http://schemas.openxmlformats.org/drawingml/2006/wordprocessingDrawing" xmlns:w10="urn:schemas-microsoft-com:office:word" xmlns:w="http://schemas.openxmlformats.org/wordprocessingml/2006/main" xmlns:w14="http://schemas.microsoft.com/office/word/2010/wordml" xmlns:w15="http://schemas.microsoft.com/office/word/2012/wordml" xmlns:w16cex="http://schemas.microsoft.com/office/word/2018/wordml/cex" xmlns:w16cid="http://schemas.microsoft.com/office/word/2016/wordml/cid" xmlns:w16="http://schemas.microsoft.com/office/word/2018/wordml" xmlns:w16sdtdh="http://schemas.microsoft.com/office/word/2020/wordml/sdtdatahash" xmlns:w16se="http://schemas.microsoft.com/office/word/2015/wordml/symex" xmlns:wpg="http://schemas.microsoft.com/office/word/2010/wordprocessingGroup" xmlns:wpi="http://schemas.microsoft.com/office/word/2010/wordprocessingInk" xmlns:wne="http://schemas.microsoft.com/office/word/2006/wordml" xmlns:wps="http://schemas.microsoft.com/office/word/2010/wordprocessingShape" mc:Ignorable="w14 w15 w16se w16cid w16 w16cex w16sdtdh wp14">
+<w:numbering xmlns:wpc="http://schemas.microsoft.com/office/word/2010/wordprocessingCanvas" xmlns:cx="http://schemas.microsoft.com/office/drawing/2014/chartex" xmlns:cx1="http://schemas.microsoft.com/office/drawing/2015/9/8/chartex" xmlns:cx2="http://schemas.microsoft.com/office/drawing/2015/10/21/chartex" xmlns:cx3="http://schemas.microsoft.com/office/drawing/2016/5/9/chartex" xmlns:cx4="http://schemas.microsoft.com/office/drawing/2016/5/10/chartex" xmlns:cx5="http://schemas.microsoft.com/office/drawing/2016/5/11/chartex" xmlns:cx6="http://schemas.microsoft.com/office/drawing/2016/5/12/chartex" xmlns:cx7="http://schemas.microsoft.com/office/drawing/2016/5/13/chartex" xmlns:cx8="http://schemas.microsoft.com/office/drawing/2016/5/14/chartex" xmlns:mc="http://schemas.openxmlformats.org/markup-compatibility/2006" xmlns:aink="http://schemas.microsoft.com/office/drawing/2016/ink" xmlns:am3d="http://schemas.microsoft.com/office/drawing/2017/model3d" xmlns:o="urn:schemas-microsoft-com:office:office" xmlns:oel="http://schemas.microsoft.com/office/2019/extlst" xmlns:r="http://schemas.openxmlformats.org/officeDocument/2006/relationships" xmlns:m="http://schemas.openxmlformats.org/officeDocument/2006/math" xmlns:v="urn:schemas-microsoft-com:vml" xmlns:wp14="http://schemas.microsoft.com/office/word/2010/wordprocessingDrawing" xmlns:wp="http://schemas.openxmlformats.org/drawingml/2006/wordprocessingDrawing" xmlns:w10="urn:schemas-microsoft-com:office:word" xmlns:w="http://schemas.openxmlformats.org/wordprocessingml/2006/main" xmlns:w14="http://schemas.microsoft.com/office/word/2010/wordml" xmlns:w15="http://schemas.microsoft.com/office/word/2012/wordml" xmlns:w16cex="http://schemas.microsoft.com/office/word/2018/wordml/cex" xmlns:w16cid="http://schemas.microsoft.com/office/word/2016/wordml/cid" xmlns:w16="http://schemas.microsoft.com/office/word/2018/wordml" xmlns:w16du="http://schemas.microsoft.com/office/word/2023/wordml/word16du" xmlns:w16sdtdh="http://schemas.microsoft.com/office/word/2020/wordml/sdtdatahash" xmlns:w16se="http://schemas.microsoft.com/office/word/2015/wordml/symex" xmlns:wpg="http://schemas.microsoft.com/office/word/2010/wordprocessingGroup" xmlns:wpi="http://schemas.microsoft.com/office/word/2010/wordprocessingInk" xmlns:wne="http://schemas.microsoft.com/office/word/2006/wordml" xmlns:wps="http://schemas.microsoft.com/office/word/2010/wordprocessingShape" mc:Ignorable="w14 w15 w16se w16cid w16 w16cex w16sdtdh w16du wp14">
   <w:abstractNum w:abstractNumId="0" w15:restartNumberingAfterBreak="0">
     <w:nsid w:val="2F494EE3"/>
     <w:multiLevelType w:val="hybridMultilevel"/>
@@ -831,17 +837,17 @@
       </w:pPr>
     </w:lvl>
   </w:abstractNum>
-  <w:num w:numId="1">
+  <w:num w:numId="1" w16cid:durableId="355271462">
     <w:abstractNumId w:val="1"/>
   </w:num>
-  <w:num w:numId="2">
+  <w:num w:numId="2" w16cid:durableId="1395198118">
     <w:abstractNumId w:val="0"/>
   </w:num>
 </w:numbering>
 </file>
 
 <file path=word/styles.xml><?xml version="1.0" encoding="utf-8"?>
-<w:styles xmlns:mc="http://schemas.openxmlformats.org/markup-compatibility/2006" xmlns:r="http://schemas.openxmlformats.org/officeDocument/2006/relationships" xmlns:w="http://schemas.openxmlformats.org/wordprocessingml/2006/main" xmlns:w14="http://schemas.microsoft.com/office/word/2010/wordml" xmlns:w15="http://schemas.microsoft.com/office/word/2012/wordml" xmlns:w16cex="http://schemas.microsoft.com/office/word/2018/wordml/cex" xmlns:w16cid="http://schemas.microsoft.com/office/word/2016/wordml/cid" xmlns:w16="http://schemas.microsoft.com/office/word/2018/wordml" xmlns:w16sdtdh="http://schemas.microsoft.com/office/word/2020/wordml/sdtdatahash" xmlns:w16se="http://schemas.microsoft.com/office/word/2015/wordml/symex" mc:Ignorable="w14 w15 w16se w16cid w16 w16cex w16sdtdh">
+<w:styles xmlns:mc="http://schemas.openxmlformats.org/markup-compatibility/2006" xmlns:r="http://schemas.openxmlformats.org/officeDocument/2006/relationships" xmlns:w="http://schemas.openxmlformats.org/wordprocessingml/2006/main" xmlns:w14="http://schemas.microsoft.com/office/word/2010/wordml" xmlns:w15="http://schemas.microsoft.com/office/word/2012/wordml" xmlns:w16cex="http://schemas.microsoft.com/office/word/2018/wordml/cex" xmlns:w16cid="http://schemas.microsoft.com/office/word/2016/wordml/cid" xmlns:w16="http://schemas.microsoft.com/office/word/2018/wordml" xmlns:w16du="http://schemas.microsoft.com/office/word/2023/wordml/word16du" xmlns:w16sdtdh="http://schemas.microsoft.com/office/word/2020/wordml/sdtdatahash" xmlns:w16se="http://schemas.microsoft.com/office/word/2015/wordml/symex" mc:Ignorable="w14 w15 w16se w16cid w16 w16cex w16sdtdh w16du">
   <w:docDefaults>
     <w:rPrDefault>
       <w:rPr>

</xml_diff>